<commit_message>
fix(forms): remediate BM-058 BM-156 and BM-213
</commit_message>
<xml_diff>
--- a/storage/templates/normalized-docx/BM-213/BM-213_normalized.docx
+++ b/storage/templates/normalized-docx/BM-213/BM-213_normalized.docx
@@ -44,7 +44,7 @@
                 <w:szCs w:val="26"/>
                 <w:lang w:val="en-US" w:eastAsia="en-US"/>
               </w:rPr>
-              <w:t>VIỆN KIỂM SÁT</w:t>
+              <w:t xml:space="preserve">{{agency.parentName}} {{agency.name}}</w:t>
             </w:r>
             <w:r>
               <w:rPr>
@@ -65,7 +65,7 @@
                 <w:szCs w:val="26"/>
                 <w:lang w:val="en-US" w:eastAsia="en-US"/>
               </w:rPr>
-              <w:t xml:space="preserve"> </w:t>
+              <w:t xml:space="preserve"/>
             </w:r>
             <w:r>
               <w:rPr>
@@ -74,7 +74,7 @@
                 <w:szCs w:val="26"/>
                 <w:lang w:val="en-US" w:eastAsia="en-US"/>
               </w:rPr>
-              <w:t>…</w:t>
+              <w:t xml:space="preserve"/>
             </w:r>
             <w:r>
               <w:rPr>
@@ -84,7 +84,7 @@
                 <w:szCs w:val="24"/>
                 <w:lang w:val="en-US" w:eastAsia="en-US"/>
               </w:rPr>
-              <w:t xml:space="preserve"> </w:t>
+              <w:t xml:space="preserve"/>
             </w:r>
             <w:r>
               <w:rPr>
@@ -104,7 +104,7 @@
                 <w:szCs w:val="24"/>
                 <w:lang w:val="en-US" w:eastAsia="en-US"/>
               </w:rPr>
-              <w:t>.................................................</w:t>
+              <w:t xml:space="preserve"/>
             </w:r>
           </w:p>
           <w:p>
@@ -404,37 +404,37 @@
               <w:rPr>
                 <w:rFonts w:ascii="Times New Roman" w:hAnsi="Times New Roman"/>
               </w:rPr>
-              <w:t>Số</w:t>
-            </w:r>
-            <w:r>
-              <w:rPr>
-                <w:rFonts w:ascii="Times New Roman" w:hAnsi="Times New Roman"/>
-              </w:rPr>
-              <w:t>:</w:t>
-            </w:r>
-            <w:r>
-              <w:rPr>
-                <w:rFonts w:ascii="Times New Roman" w:hAnsi="Times New Roman"/>
-              </w:rPr>
-              <w:t xml:space="preserve"> </w:t>
-            </w:r>
-            <w:r>
-              <w:rPr>
-                <w:rFonts w:ascii="Times New Roman" w:hAnsi="Times New Roman"/>
-              </w:rPr>
-              <w:t>…/YC</w:t>
-            </w:r>
-            <w:r>
-              <w:rPr>
-                <w:rFonts w:ascii="Times New Roman" w:hAnsi="Times New Roman"/>
-              </w:rPr>
-              <w:t>-VKS</w:t>
-            </w:r>
-            <w:r>
-              <w:rPr>
-                <w:rFonts w:ascii="Times New Roman" w:hAnsi="Times New Roman"/>
-              </w:rPr>
-              <w:t>…-</w:t>
+              <w:t xml:space="preserve">Số: {{document.documentCode}}</w:t>
+            </w:r>
+            <w:r>
+              <w:rPr>
+                <w:rFonts w:ascii="Times New Roman" w:hAnsi="Times New Roman"/>
+              </w:rPr>
+              <w:t xml:space="preserve"/>
+            </w:r>
+            <w:r>
+              <w:rPr>
+                <w:rFonts w:ascii="Times New Roman" w:hAnsi="Times New Roman"/>
+              </w:rPr>
+              <w:t xml:space="preserve"/>
+            </w:r>
+            <w:r>
+              <w:rPr>
+                <w:rFonts w:ascii="Times New Roman" w:hAnsi="Times New Roman"/>
+              </w:rPr>
+              <w:t xml:space="preserve"/>
+            </w:r>
+            <w:r>
+              <w:rPr>
+                <w:rFonts w:ascii="Times New Roman" w:hAnsi="Times New Roman"/>
+              </w:rPr>
+              <w:t xml:space="preserve"/>
+            </w:r>
+            <w:r>
+              <w:rPr>
+                <w:rFonts w:ascii="Times New Roman" w:hAnsi="Times New Roman"/>
+              </w:rPr>
+              <w:t xml:space="preserve"/>
             </w:r>
             <w:r>
               <w:rPr>
@@ -447,7 +447,7 @@
               <w:rPr>
                 <w:rFonts w:ascii="Times New Roman" w:hAnsi="Times New Roman"/>
               </w:rPr>
-              <w:t>…</w:t>
+              <w:t xml:space="preserve"/>
             </w:r>
           </w:p>
         </w:tc>
@@ -476,56 +476,56 @@
                 <w:rFonts w:ascii="Times New Roman" w:hAnsi="Times New Roman"/>
                 <w:i/>
               </w:rPr>
-              <w:t>…, ngày</w:t>
+              <w:t xml:space="preserve">{{document.issuePlaceAndDateLine}}</w:t>
             </w:r>
             <w:r>
               <w:rPr>
                 <w:rFonts w:ascii="Times New Roman" w:hAnsi="Times New Roman"/>
                 <w:i/>
               </w:rPr>
-              <w:t xml:space="preserve"> </w:t>
+              <w:t xml:space="preserve"/>
             </w:r>
             <w:r>
               <w:rPr>
                 <w:rFonts w:ascii="Times New Roman" w:hAnsi="Times New Roman"/>
                 <w:i/>
               </w:rPr>
-              <w:t>… tháng</w:t>
+              <w:t xml:space="preserve"/>
             </w:r>
             <w:r>
               <w:rPr>
                 <w:rFonts w:ascii="Times New Roman" w:hAnsi="Times New Roman"/>
                 <w:i/>
               </w:rPr>
-              <w:t xml:space="preserve"> </w:t>
+              <w:t xml:space="preserve"/>
             </w:r>
             <w:r>
               <w:rPr>
                 <w:rFonts w:ascii="Times New Roman" w:hAnsi="Times New Roman"/>
                 <w:i/>
               </w:rPr>
-              <w:t>…</w:t>
+              <w:t xml:space="preserve"/>
             </w:r>
             <w:r>
               <w:rPr>
                 <w:rFonts w:ascii="Times New Roman" w:hAnsi="Times New Roman"/>
                 <w:i/>
               </w:rPr>
-              <w:t xml:space="preserve"> </w:t>
+              <w:t xml:space="preserve"/>
             </w:r>
             <w:r>
               <w:rPr>
                 <w:rFonts w:ascii="Times New Roman" w:hAnsi="Times New Roman"/>
                 <w:i/>
               </w:rPr>
-              <w:t>năm 20</w:t>
+              <w:t xml:space="preserve"/>
             </w:r>
             <w:r>
               <w:rPr>
                 <w:rFonts w:ascii="Times New Roman" w:hAnsi="Times New Roman"/>
                 <w:i/>
               </w:rPr>
-              <w:t>…</w:t>
+              <w:t xml:space="preserve"/>
             </w:r>
           </w:p>
         </w:tc>
@@ -644,7 +644,7 @@
           <w:bCs/>
           <w:sz w:val="24"/>
         </w:rPr>
-        <w:t>VIỆN TR</w:t>
+        <w:t xml:space="preserve">{{official.issuerTitle}}</w:t>
       </w:r>
       <w:r>
         <w:rPr>
@@ -654,7 +654,7 @@
           <w:sz w:val="24"/>
           <w:lang w:val="vi-VN"/>
         </w:rPr>
-        <w:t>ƯỞNG VIỆN KIỂM SÁT</w:t>
+        <w:t xml:space="preserve"/>
       </w:r>
       <w:r>
         <w:rPr>
@@ -664,7 +664,7 @@
           <w:sz w:val="24"/>
           <w:vertAlign w:val="superscript"/>
         </w:rPr>
-        <w:t>2</w:t>
+        <w:t xml:space="preserve"/>
       </w:r>
       <w:r>
         <w:rPr>
@@ -673,7 +673,7 @@
           <w:bCs/>
           <w:sz w:val="24"/>
         </w:rPr>
-        <w:t>…</w:t>
+        <w:t xml:space="preserve"/>
       </w:r>
     </w:p>
     <w:p>
@@ -767,7 +767,7 @@
         <w:rPr>
           <w:rFonts w:ascii="Times New Roman" w:hAnsi="Times New Roman"/>
         </w:rPr>
-        <w:t>Họ tên:</w:t>
+        <w:t xml:space="preserve">Họ tên: {{person.fullName}} Giới tính: {{person.genderLabel}}</w:t>
       </w:r>
       <w:r>
         <w:rPr>
@@ -780,19 +780,19 @@
         <w:rPr>
           <w:rFonts w:ascii="Times New Roman" w:hAnsi="Times New Roman"/>
         </w:rPr>
-        <w:t>......................................................................................... Giới tính:</w:t>
-      </w:r>
-      <w:r>
-        <w:rPr>
-          <w:rFonts w:ascii="Times New Roman" w:hAnsi="Times New Roman"/>
-        </w:rPr>
-        <w:t>…</w:t>
-      </w:r>
-      <w:r>
-        <w:rPr>
-          <w:rFonts w:ascii="Times New Roman" w:hAnsi="Times New Roman"/>
-        </w:rPr>
-        <w:t>……</w:t>
+        <w:t xml:space="preserve"/>
+      </w:r>
+      <w:r>
+        <w:rPr>
+          <w:rFonts w:ascii="Times New Roman" w:hAnsi="Times New Roman"/>
+        </w:rPr>
+        <w:t xml:space="preserve"/>
+      </w:r>
+      <w:r>
+        <w:rPr>
+          <w:rFonts w:ascii="Times New Roman" w:hAnsi="Times New Roman"/>
+        </w:rPr>
+        <w:t xml:space="preserve"/>
       </w:r>
     </w:p>
     <w:p>
@@ -807,25 +807,25 @@
         <w:rPr>
           <w:rFonts w:ascii="Times New Roman" w:hAnsi="Times New Roman"/>
         </w:rPr>
-        <w:t xml:space="preserve">Tên gọi khác: </w:t>
-      </w:r>
-      <w:r>
-        <w:rPr>
-          <w:rFonts w:ascii="Times New Roman" w:hAnsi="Times New Roman"/>
-        </w:rPr>
-        <w:t>…………..</w:t>
-      </w:r>
-      <w:r>
-        <w:rPr>
-          <w:rFonts w:ascii="Times New Roman" w:hAnsi="Times New Roman"/>
-        </w:rPr>
-        <w:t>..................................................................................</w:t>
-      </w:r>
-      <w:r>
-        <w:rPr>
-          <w:rFonts w:ascii="Times New Roman" w:hAnsi="Times New Roman"/>
-        </w:rPr>
-        <w:t>.......</w:t>
+        <w:t xml:space="preserve">Tên gọi khác: {{person.otherName}}</w:t>
+      </w:r>
+      <w:r>
+        <w:rPr>
+          <w:rFonts w:ascii="Times New Roman" w:hAnsi="Times New Roman"/>
+        </w:rPr>
+        <w:t xml:space="preserve"/>
+      </w:r>
+      <w:r>
+        <w:rPr>
+          <w:rFonts w:ascii="Times New Roman" w:hAnsi="Times New Roman"/>
+        </w:rPr>
+        <w:t xml:space="preserve"/>
+      </w:r>
+      <w:r>
+        <w:rPr>
+          <w:rFonts w:ascii="Times New Roman" w:hAnsi="Times New Roman"/>
+        </w:rPr>
+        <w:t xml:space="preserve"/>
       </w:r>
     </w:p>
     <w:p>
@@ -840,25 +840,25 @@
         <w:rPr>
           <w:rFonts w:ascii="Times New Roman" w:hAnsi="Times New Roman"/>
         </w:rPr>
-        <w:t>Sinh ngày ............ tháng ............ n</w:t>
+        <w:t xml:space="preserve">Sinh ngày {{person.dateOfBirthText}} tại: {{person.placeOfBirth}}</w:t>
       </w:r>
       <w:r>
         <w:rPr>
           <w:rFonts w:ascii="Times New Roman" w:hAnsi="Times New Roman" w:hint="eastAsia"/>
         </w:rPr>
-        <w:t>ă</w:t>
-      </w:r>
-      <w:r>
-        <w:rPr>
-          <w:rFonts w:ascii="Times New Roman" w:hAnsi="Times New Roman"/>
-        </w:rPr>
-        <w:t>m ...................... tại:</w:t>
-      </w:r>
-      <w:r>
-        <w:rPr>
-          <w:rFonts w:ascii="Times New Roman" w:hAnsi="Times New Roman"/>
-        </w:rPr>
-        <w:t>……………………..</w:t>
+        <w:t xml:space="preserve"/>
+      </w:r>
+      <w:r>
+        <w:rPr>
+          <w:rFonts w:ascii="Times New Roman" w:hAnsi="Times New Roman"/>
+        </w:rPr>
+        <w:t xml:space="preserve"/>
+      </w:r>
+      <w:r>
+        <w:rPr>
+          <w:rFonts w:ascii="Times New Roman" w:hAnsi="Times New Roman"/>
+        </w:rPr>
+        <w:t xml:space="preserve"/>
       </w:r>
       <w:r>
         <w:rPr>
@@ -870,7 +870,7 @@
         <w:rPr>
           <w:rFonts w:ascii="Times New Roman" w:hAnsi="Times New Roman"/>
         </w:rPr>
-        <w:t>…...</w:t>
+        <w:t xml:space="preserve"/>
       </w:r>
     </w:p>
     <w:p>
@@ -885,13 +885,13 @@
         <w:rPr>
           <w:rFonts w:ascii="Times New Roman" w:hAnsi="Times New Roman"/>
         </w:rPr>
-        <w:t>Quốc tịch: .............................................; Dân tộc: ......................; Tôn giáo:</w:t>
-      </w:r>
-      <w:r>
-        <w:rPr>
-          <w:rFonts w:ascii="Times New Roman" w:hAnsi="Times New Roman"/>
-        </w:rPr>
-        <w:t>…</w:t>
+        <w:t xml:space="preserve">Quốc tịch: {{person.nationality}}; Dân tộc: {{person.ethnicity}}; Tôn giáo: {{person.religion}}</w:t>
+      </w:r>
+      <w:r>
+        <w:rPr>
+          <w:rFonts w:ascii="Times New Roman" w:hAnsi="Times New Roman"/>
+        </w:rPr>
+        <w:t xml:space="preserve"/>
       </w:r>
       <w:r>
         <w:rPr>
@@ -903,7 +903,7 @@
         <w:rPr>
           <w:rFonts w:ascii="Times New Roman" w:hAnsi="Times New Roman"/>
         </w:rPr>
-        <w:t>…...</w:t>
+        <w:t xml:space="preserve"/>
       </w:r>
     </w:p>
     <w:p>
@@ -918,19 +918,19 @@
         <w:rPr>
           <w:rFonts w:ascii="Times New Roman" w:hAnsi="Times New Roman"/>
         </w:rPr>
-        <w:t>Nghề nghiệp:........................................................................................</w:t>
-      </w:r>
-      <w:r>
-        <w:rPr>
-          <w:rFonts w:ascii="Times New Roman" w:hAnsi="Times New Roman"/>
-        </w:rPr>
-        <w:t>...............</w:t>
-      </w:r>
-      <w:r>
-        <w:rPr>
-          <w:rFonts w:ascii="Times New Roman" w:hAnsi="Times New Roman"/>
-        </w:rPr>
-        <w:t>......</w:t>
+        <w:t xml:space="preserve">Nghề nghiệp: {{person.occupation}}</w:t>
+      </w:r>
+      <w:r>
+        <w:rPr>
+          <w:rFonts w:ascii="Times New Roman" w:hAnsi="Times New Roman"/>
+        </w:rPr>
+        <w:t xml:space="preserve"/>
+      </w:r>
+      <w:r>
+        <w:rPr>
+          <w:rFonts w:ascii="Times New Roman" w:hAnsi="Times New Roman"/>
+        </w:rPr>
+        <w:t xml:space="preserve"/>
       </w:r>
     </w:p>
     <w:p>
@@ -945,25 +945,25 @@
         <w:rPr>
           <w:rFonts w:ascii="Times New Roman" w:hAnsi="Times New Roman"/>
         </w:rPr>
-        <w:t>Số CMND/Thẻ CCCD/Thẻ CC/Hộ chiếu</w:t>
-      </w:r>
-      <w:r>
-        <w:rPr>
-          <w:rFonts w:ascii="Times New Roman" w:hAnsi="Times New Roman"/>
-        </w:rPr>
-        <w:t>/Số định danh cá nhân</w:t>
-      </w:r>
-      <w:r>
-        <w:rPr>
-          <w:rFonts w:ascii="Times New Roman" w:hAnsi="Times New Roman"/>
-        </w:rPr>
-        <w:t>:</w:t>
-      </w:r>
-      <w:r>
-        <w:rPr>
-          <w:rFonts w:ascii="Times New Roman" w:hAnsi="Times New Roman"/>
-        </w:rPr>
-        <w:t>……..…………..</w:t>
+        <w:t xml:space="preserve">Số CMND/Thẻ CCCD/Thẻ CC/Hộ chiếu/Số định danh cá nhân: {{person.identityDocumentLine}}</w:t>
+      </w:r>
+      <w:r>
+        <w:rPr>
+          <w:rFonts w:ascii="Times New Roman" w:hAnsi="Times New Roman"/>
+        </w:rPr>
+        <w:t xml:space="preserve"/>
+      </w:r>
+      <w:r>
+        <w:rPr>
+          <w:rFonts w:ascii="Times New Roman" w:hAnsi="Times New Roman"/>
+        </w:rPr>
+        <w:t xml:space="preserve"/>
+      </w:r>
+      <w:r>
+        <w:rPr>
+          <w:rFonts w:ascii="Times New Roman" w:hAnsi="Times New Roman"/>
+        </w:rPr>
+        <w:t xml:space="preserve"/>
       </w:r>
     </w:p>
     <w:p>
@@ -978,55 +978,55 @@
         <w:rPr>
           <w:rFonts w:ascii="Times New Roman" w:hAnsi="Times New Roman"/>
         </w:rPr>
-        <w:t>C</w:t>
-      </w:r>
-      <w:r>
-        <w:rPr>
-          <w:rFonts w:ascii="Times New Roman" w:hAnsi="Times New Roman"/>
-        </w:rPr>
-        <w:t>ấp ngày............ tháng ............ n</w:t>
+        <w:t xml:space="preserve">{{person.identityIssueLine}}</w:t>
+      </w:r>
+      <w:r>
+        <w:rPr>
+          <w:rFonts w:ascii="Times New Roman" w:hAnsi="Times New Roman"/>
+        </w:rPr>
+        <w:t xml:space="preserve"/>
       </w:r>
       <w:r>
         <w:rPr>
           <w:rFonts w:ascii="Times New Roman" w:hAnsi="Times New Roman" w:hint="eastAsia"/>
         </w:rPr>
-        <w:t>ă</w:t>
-      </w:r>
-      <w:r>
-        <w:rPr>
-          <w:rFonts w:ascii="Times New Roman" w:hAnsi="Times New Roman"/>
-        </w:rPr>
-        <w:t>m ................... N</w:t>
+        <w:t xml:space="preserve"/>
+      </w:r>
+      <w:r>
+        <w:rPr>
+          <w:rFonts w:ascii="Times New Roman" w:hAnsi="Times New Roman"/>
+        </w:rPr>
+        <w:t xml:space="preserve"/>
       </w:r>
       <w:r>
         <w:rPr>
           <w:rFonts w:ascii="Times New Roman" w:hAnsi="Times New Roman" w:hint="eastAsia"/>
         </w:rPr>
-        <w:t>ơ</w:t>
-      </w:r>
-      <w:r>
-        <w:rPr>
-          <w:rFonts w:ascii="Times New Roman" w:hAnsi="Times New Roman"/>
-        </w:rPr>
-        <w:t>i cấp:</w:t>
-      </w:r>
-      <w:r>
-        <w:rPr>
-          <w:rFonts w:ascii="Times New Roman" w:hAnsi="Times New Roman"/>
-        </w:rPr>
-        <w:t>………………..……</w:t>
-      </w:r>
-      <w:r>
-        <w:rPr>
-          <w:rFonts w:ascii="Times New Roman" w:hAnsi="Times New Roman"/>
-        </w:rPr>
-        <w:t>.</w:t>
-      </w:r>
-      <w:r>
-        <w:rPr>
-          <w:rFonts w:ascii="Times New Roman" w:hAnsi="Times New Roman"/>
-        </w:rPr>
-        <w:t>..</w:t>
+        <w:t xml:space="preserve"/>
+      </w:r>
+      <w:r>
+        <w:rPr>
+          <w:rFonts w:ascii="Times New Roman" w:hAnsi="Times New Roman"/>
+        </w:rPr>
+        <w:t xml:space="preserve"/>
+      </w:r>
+      <w:r>
+        <w:rPr>
+          <w:rFonts w:ascii="Times New Roman" w:hAnsi="Times New Roman"/>
+        </w:rPr>
+        <w:t xml:space="preserve"/>
+      </w:r>
+      <w:r>
+        <w:rPr>
+          <w:rFonts w:ascii="Times New Roman" w:hAnsi="Times New Roman"/>
+        </w:rPr>
+        <w:t xml:space="preserve"/>
+      </w:r>
+      <w:r>
+        <w:rPr>
+          <w:rFonts w:ascii="Times New Roman" w:hAnsi="Times New Roman"/>
+        </w:rPr>
+        <w:t xml:space="preserve"/>
       </w:r>
     </w:p>
     <w:p>
@@ -1041,37 +1041,37 @@
         <w:rPr>
           <w:rFonts w:ascii="Times New Roman" w:hAnsi="Times New Roman"/>
         </w:rPr>
-        <w:t>N</w:t>
+        <w:t xml:space="preserve">Nơi thường trú: {{person.permanentAddress}}</w:t>
       </w:r>
       <w:r>
         <w:rPr>
           <w:rFonts w:ascii="Times New Roman" w:hAnsi="Times New Roman" w:hint="eastAsia"/>
         </w:rPr>
-        <w:t>ơ</w:t>
-      </w:r>
-      <w:r>
-        <w:rPr>
-          <w:rFonts w:ascii="Times New Roman" w:hAnsi="Times New Roman"/>
-        </w:rPr>
-        <w:t>i th</w:t>
+        <w:t xml:space="preserve"/>
+      </w:r>
+      <w:r>
+        <w:rPr>
+          <w:rFonts w:ascii="Times New Roman" w:hAnsi="Times New Roman"/>
+        </w:rPr>
+        <w:t xml:space="preserve"/>
       </w:r>
       <w:r>
         <w:rPr>
           <w:rFonts w:ascii="Times New Roman" w:hAnsi="Times New Roman" w:hint="eastAsia"/>
         </w:rPr>
-        <w:t>ư</w:t>
-      </w:r>
-      <w:r>
-        <w:rPr>
-          <w:rFonts w:ascii="Times New Roman" w:hAnsi="Times New Roman"/>
-        </w:rPr>
-        <w:t>ờng trú: ………………………………………………………………</w:t>
-      </w:r>
-      <w:r>
-        <w:rPr>
-          <w:rFonts w:ascii="Times New Roman" w:hAnsi="Times New Roman"/>
-        </w:rPr>
-        <w:t>……</w:t>
+        <w:t xml:space="preserve"/>
+      </w:r>
+      <w:r>
+        <w:rPr>
+          <w:rFonts w:ascii="Times New Roman" w:hAnsi="Times New Roman"/>
+        </w:rPr>
+        <w:t xml:space="preserve"/>
+      </w:r>
+      <w:r>
+        <w:rPr>
+          <w:rFonts w:ascii="Times New Roman" w:hAnsi="Times New Roman"/>
+        </w:rPr>
+        <w:t xml:space="preserve"/>
       </w:r>
     </w:p>
     <w:p>
@@ -1086,25 +1086,25 @@
         <w:rPr>
           <w:rFonts w:ascii="Times New Roman" w:hAnsi="Times New Roman"/>
         </w:rPr>
-        <w:t>N</w:t>
+        <w:t xml:space="preserve">Nơi tạm trú: {{person.temporaryAddress}}</w:t>
       </w:r>
       <w:r>
         <w:rPr>
           <w:rFonts w:ascii="Times New Roman" w:hAnsi="Times New Roman" w:hint="eastAsia"/>
         </w:rPr>
-        <w:t>ơ</w:t>
-      </w:r>
-      <w:r>
-        <w:rPr>
-          <w:rFonts w:ascii="Times New Roman" w:hAnsi="Times New Roman"/>
-        </w:rPr>
-        <w:t>i tạm trú: ………………………………………………………………</w:t>
-      </w:r>
-      <w:r>
-        <w:rPr>
-          <w:rFonts w:ascii="Times New Roman" w:hAnsi="Times New Roman"/>
-        </w:rPr>
-        <w:t>………..</w:t>
+        <w:t xml:space="preserve"/>
+      </w:r>
+      <w:r>
+        <w:rPr>
+          <w:rFonts w:ascii="Times New Roman" w:hAnsi="Times New Roman"/>
+        </w:rPr>
+        <w:t xml:space="preserve"/>
+      </w:r>
+      <w:r>
+        <w:rPr>
+          <w:rFonts w:ascii="Times New Roman" w:hAnsi="Times New Roman"/>
+        </w:rPr>
+        <w:t xml:space="preserve"/>
       </w:r>
     </w:p>
     <w:p>
@@ -1119,25 +1119,25 @@
         <w:rPr>
           <w:rFonts w:ascii="Times New Roman" w:hAnsi="Times New Roman"/>
         </w:rPr>
-        <w:t>N</w:t>
+        <w:t xml:space="preserve">Nơi ở hiện tại: {{person.currentAddress}}</w:t>
       </w:r>
       <w:r>
         <w:rPr>
           <w:rFonts w:ascii="Times New Roman" w:hAnsi="Times New Roman" w:hint="eastAsia"/>
         </w:rPr>
-        <w:t>ơ</w:t>
-      </w:r>
-      <w:r>
-        <w:rPr>
-          <w:rFonts w:ascii="Times New Roman" w:hAnsi="Times New Roman"/>
-        </w:rPr>
-        <w:t>i ở hiện tại: …………………………………………………………</w:t>
-      </w:r>
-      <w:r>
-        <w:rPr>
-          <w:rFonts w:ascii="Times New Roman" w:hAnsi="Times New Roman"/>
-        </w:rPr>
-        <w:t>…………..</w:t>
+        <w:t xml:space="preserve"/>
+      </w:r>
+      <w:r>
+        <w:rPr>
+          <w:rFonts w:ascii="Times New Roman" w:hAnsi="Times New Roman"/>
+        </w:rPr>
+        <w:t xml:space="preserve"/>
+      </w:r>
+      <w:r>
+        <w:rPr>
+          <w:rFonts w:ascii="Times New Roman" w:hAnsi="Times New Roman"/>
+        </w:rPr>
+        <w:t xml:space="preserve"/>
       </w:r>
     </w:p>
     <w:p>
@@ -1152,31 +1152,31 @@
         <w:rPr>
           <w:rFonts w:ascii="Times New Roman" w:hAnsi="Times New Roman"/>
         </w:rPr>
-        <w:t>l</w:t>
-      </w:r>
-      <w:r>
-        <w:rPr>
-          <w:rFonts w:ascii="Times New Roman" w:hAnsi="Times New Roman"/>
-        </w:rPr>
-        <w:t xml:space="preserve">à </w:t>
-      </w:r>
-      <w:r>
-        <w:rPr>
-          <w:rFonts w:ascii="Times New Roman" w:hAnsi="Times New Roman"/>
-        </w:rPr>
-        <w:t>bị hại/người làm chứng</w:t>
-      </w:r>
-      <w:r>
-        <w:rPr>
-          <w:rFonts w:ascii="Times New Roman" w:hAnsi="Times New Roman"/>
-        </w:rPr>
-        <w:t xml:space="preserve"> </w:t>
-      </w:r>
-      <w:r>
-        <w:rPr>
-          <w:rFonts w:ascii="Times New Roman" w:hAnsi="Times New Roman"/>
-        </w:rPr>
-        <w:t>trong vụ án</w:t>
+        <w:t xml:space="preserve">{{juvenileProtection.contextLine}}</w:t>
+      </w:r>
+      <w:r>
+        <w:rPr>
+          <w:rFonts w:ascii="Times New Roman" w:hAnsi="Times New Roman"/>
+        </w:rPr>
+        <w:t xml:space="preserve"/>
+      </w:r>
+      <w:r>
+        <w:rPr>
+          <w:rFonts w:ascii="Times New Roman" w:hAnsi="Times New Roman"/>
+        </w:rPr>
+        <w:t xml:space="preserve"/>
+      </w:r>
+      <w:r>
+        <w:rPr>
+          <w:rFonts w:ascii="Times New Roman" w:hAnsi="Times New Roman"/>
+        </w:rPr>
+        <w:t xml:space="preserve"/>
+      </w:r>
+      <w:r>
+        <w:rPr>
+          <w:rFonts w:ascii="Times New Roman" w:hAnsi="Times New Roman"/>
+        </w:rPr>
+        <w:t xml:space="preserve"/>
       </w:r>
       <w:r>
         <w:rPr>
@@ -1189,43 +1189,43 @@
         <w:rPr>
           <w:rFonts w:ascii="Times New Roman" w:hAnsi="Times New Roman"/>
         </w:rPr>
-        <w:t>…</w:t>
-      </w:r>
-      <w:r>
-        <w:rPr>
-          <w:rFonts w:ascii="Times New Roman" w:hAnsi="Times New Roman"/>
-        </w:rPr>
-        <w:t xml:space="preserve"> </w:t>
-      </w:r>
-      <w:r>
-        <w:rPr>
-          <w:rFonts w:ascii="Times New Roman" w:hAnsi="Times New Roman"/>
-        </w:rPr>
-        <w:t>có</w:t>
-      </w:r>
-      <w:r>
-        <w:rPr>
-          <w:rFonts w:ascii="Times New Roman" w:hAnsi="Times New Roman"/>
-        </w:rPr>
-        <w:t xml:space="preserve"> </w:t>
-      </w:r>
-      <w:r>
-        <w:rPr>
-          <w:rFonts w:ascii="Times New Roman" w:hAnsi="Times New Roman"/>
-        </w:rPr>
-        <w:t>thông tin/hình ảnh</w:t>
-      </w:r>
-      <w:r>
-        <w:rPr>
-          <w:rFonts w:ascii="Times New Roman" w:hAnsi="Times New Roman"/>
-        </w:rPr>
-        <w:t>/</w:t>
-      </w:r>
-      <w:r>
-        <w:rPr>
-          <w:rFonts w:ascii="Times New Roman" w:hAnsi="Times New Roman"/>
-        </w:rPr>
-        <w:t>… cá nhân</w:t>
+        <w:t xml:space="preserve"/>
+      </w:r>
+      <w:r>
+        <w:rPr>
+          <w:rFonts w:ascii="Times New Roman" w:hAnsi="Times New Roman"/>
+        </w:rPr>
+        <w:t xml:space="preserve"/>
+      </w:r>
+      <w:r>
+        <w:rPr>
+          <w:rFonts w:ascii="Times New Roman" w:hAnsi="Times New Roman"/>
+        </w:rPr>
+        <w:t xml:space="preserve"/>
+      </w:r>
+      <w:r>
+        <w:rPr>
+          <w:rFonts w:ascii="Times New Roman" w:hAnsi="Times New Roman"/>
+        </w:rPr>
+        <w:t xml:space="preserve"/>
+      </w:r>
+      <w:r>
+        <w:rPr>
+          <w:rFonts w:ascii="Times New Roman" w:hAnsi="Times New Roman"/>
+        </w:rPr>
+        <w:t xml:space="preserve"/>
+      </w:r>
+      <w:r>
+        <w:rPr>
+          <w:rFonts w:ascii="Times New Roman" w:hAnsi="Times New Roman"/>
+        </w:rPr>
+        <w:t xml:space="preserve"/>
+      </w:r>
+      <w:r>
+        <w:rPr>
+          <w:rFonts w:ascii="Times New Roman" w:hAnsi="Times New Roman"/>
+        </w:rPr>
+        <w:t xml:space="preserve"/>
       </w:r>
       <w:r>
         <w:rPr>
@@ -1233,13 +1233,13 @@
           <w:i/>
           <w:iCs/>
         </w:rPr>
-        <w:t xml:space="preserve"> </w:t>
-      </w:r>
-      <w:r>
-        <w:rPr>
-          <w:rFonts w:ascii="Times New Roman" w:hAnsi="Times New Roman"/>
-        </w:rPr>
-        <w:t>đã/đang/có nguy cơ</w:t>
+        <w:t xml:space="preserve"/>
+      </w:r>
+      <w:r>
+        <w:rPr>
+          <w:rFonts w:ascii="Times New Roman" w:hAnsi="Times New Roman"/>
+        </w:rPr>
+        <w:t xml:space="preserve"/>
       </w:r>
       <w:r>
         <w:rPr>
@@ -1247,19 +1247,19 @@
           <w:i/>
           <w:iCs/>
         </w:rPr>
-        <w:t xml:space="preserve"> </w:t>
-      </w:r>
-      <w:r>
-        <w:rPr>
-          <w:rFonts w:ascii="Times New Roman" w:hAnsi="Times New Roman"/>
-        </w:rPr>
-        <w:t>bị phát tán trên không gian mạng, ảnh hưởng nghiêm trọng đến quyền riêng tư, danh dự, nhân phẩm và quyền lợi ích hợp pháp của người chưa thành niên theo quy định pháp luật</w:t>
-      </w:r>
-      <w:r>
-        <w:rPr>
-          <w:rFonts w:ascii="Times New Roman" w:hAnsi="Times New Roman"/>
-        </w:rPr>
-        <w:t>,</w:t>
+        <w:t xml:space="preserve"/>
+      </w:r>
+      <w:r>
+        <w:rPr>
+          <w:rFonts w:ascii="Times New Roman" w:hAnsi="Times New Roman"/>
+        </w:rPr>
+        <w:t xml:space="preserve"/>
+      </w:r>
+      <w:r>
+        <w:rPr>
+          <w:rFonts w:ascii="Times New Roman" w:hAnsi="Times New Roman"/>
+        </w:rPr>
+        <w:t xml:space="preserve"/>
       </w:r>
     </w:p>
     <w:p>
@@ -1297,21 +1297,21 @@
           <w:bCs/>
           <w:spacing w:val="-4"/>
         </w:rPr>
-        <w:t>1.</w:t>
-      </w:r>
-      <w:r>
-        <w:rPr>
-          <w:rFonts w:ascii="Times New Roman" w:hAnsi="Times New Roman"/>
-          <w:spacing w:val="-4"/>
-        </w:rPr>
-        <w:t xml:space="preserve"> </w:t>
-      </w:r>
-      <w:r>
-        <w:rPr>
-          <w:rFonts w:ascii="Times New Roman" w:hAnsi="Times New Roman"/>
-          <w:spacing w:val="-4"/>
-        </w:rPr>
-        <w:t>Cơ quan, người có thẩm quyền</w:t>
+        <w:t xml:space="preserve">1. {{juvenileProtection.article1Line}}</w:t>
+      </w:r>
+      <w:r>
+        <w:rPr>
+          <w:rFonts w:ascii="Times New Roman" w:hAnsi="Times New Roman"/>
+          <w:spacing w:val="-4"/>
+        </w:rPr>
+        <w:t xml:space="preserve"/>
+      </w:r>
+      <w:r>
+        <w:rPr>
+          <w:rFonts w:ascii="Times New Roman" w:hAnsi="Times New Roman"/>
+          <w:spacing w:val="-4"/>
+        </w:rPr>
+        <w:t xml:space="preserve"/>
       </w:r>
       <w:r>
         <w:rPr>
@@ -1326,21 +1326,21 @@
           <w:rFonts w:ascii="Times New Roman" w:hAnsi="Times New Roman"/>
           <w:spacing w:val="-4"/>
         </w:rPr>
-        <w:t>…</w:t>
-      </w:r>
-      <w:r>
-        <w:rPr>
-          <w:rFonts w:ascii="Times New Roman" w:hAnsi="Times New Roman"/>
-          <w:spacing w:val="-4"/>
-        </w:rPr>
-        <w:t xml:space="preserve"> </w:t>
-      </w:r>
-      <w:r>
-        <w:rPr>
-          <w:rFonts w:ascii="Times New Roman" w:hAnsi="Times New Roman"/>
-          <w:spacing w:val="-4"/>
-        </w:rPr>
-        <w:t xml:space="preserve">áp dụng các biện pháp </w:t>
+        <w:t xml:space="preserve"/>
+      </w:r>
+      <w:r>
+        <w:rPr>
+          <w:rFonts w:ascii="Times New Roman" w:hAnsi="Times New Roman"/>
+          <w:spacing w:val="-4"/>
+        </w:rPr>
+        <w:t xml:space="preserve"/>
+      </w:r>
+      <w:r>
+        <w:rPr>
+          <w:rFonts w:ascii="Times New Roman" w:hAnsi="Times New Roman"/>
+          <w:spacing w:val="-4"/>
+        </w:rPr>
+        <w:t xml:space="preserve"/>
       </w:r>
       <w:r>
         <w:rPr>
@@ -1348,28 +1348,28 @@
           <w:iCs/>
           <w:spacing w:val="-4"/>
         </w:rPr>
-        <w:t>kỹ thuật</w:t>
-      </w:r>
-      <w:r>
-        <w:rPr>
-          <w:rFonts w:ascii="Times New Roman" w:hAnsi="Times New Roman"/>
-          <w:spacing w:val="-4"/>
-        </w:rPr>
-        <w:t xml:space="preserve"> để bảo vệ thông tin cá nhân, danh dự, nhân phẩm của người chưa thành niên là bị hại</w:t>
-      </w:r>
-      <w:r>
-        <w:rPr>
-          <w:rFonts w:ascii="Times New Roman" w:hAnsi="Times New Roman"/>
-          <w:spacing w:val="-4"/>
-        </w:rPr>
-        <w:t>/</w:t>
-      </w:r>
-      <w:r>
-        <w:rPr>
-          <w:rFonts w:ascii="Times New Roman" w:hAnsi="Times New Roman"/>
-          <w:spacing w:val="-4"/>
-        </w:rPr>
-        <w:t xml:space="preserve">người làm chứng bị phát tán trên không gian mạng. </w:t>
+        <w:t xml:space="preserve"/>
+      </w:r>
+      <w:r>
+        <w:rPr>
+          <w:rFonts w:ascii="Times New Roman" w:hAnsi="Times New Roman"/>
+          <w:spacing w:val="-4"/>
+        </w:rPr>
+        <w:t xml:space="preserve"/>
+      </w:r>
+      <w:r>
+        <w:rPr>
+          <w:rFonts w:ascii="Times New Roman" w:hAnsi="Times New Roman"/>
+          <w:spacing w:val="-4"/>
+        </w:rPr>
+        <w:t xml:space="preserve"/>
+      </w:r>
+      <w:r>
+        <w:rPr>
+          <w:rFonts w:ascii="Times New Roman" w:hAnsi="Times New Roman"/>
+          <w:spacing w:val="-4"/>
+        </w:rPr>
+        <w:t xml:space="preserve"/>
       </w:r>
     </w:p>
     <w:p>
@@ -1386,7 +1386,7 @@
           <w:rFonts w:ascii="Times New Roman" w:hAnsi="Times New Roman"/>
           <w:spacing w:val="-4"/>
         </w:rPr>
-        <w:t>Cơ quan, người có thẩm quyền</w:t>
+        <w:t xml:space="preserve">{{juvenileProtection.resultDeadlineLine}}</w:t>
       </w:r>
       <w:r>
         <w:rPr>
@@ -1394,35 +1394,35 @@
           <w:spacing w:val="-4"/>
           <w:vertAlign w:val="superscript"/>
         </w:rPr>
-        <w:t>7</w:t>
-      </w:r>
-      <w:r>
-        <w:rPr>
-          <w:rFonts w:ascii="Times New Roman" w:hAnsi="Times New Roman"/>
-          <w:spacing w:val="-4"/>
-        </w:rPr>
-        <w:t>…</w:t>
-      </w:r>
-      <w:r>
-        <w:rPr>
-          <w:rFonts w:ascii="Times New Roman" w:hAnsi="Times New Roman"/>
-          <w:spacing w:val="-4"/>
-        </w:rPr>
-        <w:t xml:space="preserve"> </w:t>
-      </w:r>
-      <w:r>
-        <w:rPr>
-          <w:rFonts w:ascii="Times New Roman" w:hAnsi="Times New Roman"/>
-          <w:spacing w:val="-4"/>
-        </w:rPr>
-        <w:t>t</w:t>
-      </w:r>
-      <w:r>
-        <w:rPr>
-          <w:rFonts w:ascii="Times New Roman" w:hAnsi="Times New Roman"/>
-          <w:spacing w:val="-4"/>
-        </w:rPr>
-        <w:t>hông báo kết quả thực hiện cho Viện kiểm sát</w:t>
+        <w:t xml:space="preserve"/>
+      </w:r>
+      <w:r>
+        <w:rPr>
+          <w:rFonts w:ascii="Times New Roman" w:hAnsi="Times New Roman"/>
+          <w:spacing w:val="-4"/>
+        </w:rPr>
+        <w:t xml:space="preserve"/>
+      </w:r>
+      <w:r>
+        <w:rPr>
+          <w:rFonts w:ascii="Times New Roman" w:hAnsi="Times New Roman"/>
+          <w:spacing w:val="-4"/>
+        </w:rPr>
+        <w:t xml:space="preserve"/>
+      </w:r>
+      <w:r>
+        <w:rPr>
+          <w:rFonts w:ascii="Times New Roman" w:hAnsi="Times New Roman"/>
+          <w:spacing w:val="-4"/>
+        </w:rPr>
+        <w:t xml:space="preserve"/>
+      </w:r>
+      <w:r>
+        <w:rPr>
+          <w:rFonts w:ascii="Times New Roman" w:hAnsi="Times New Roman"/>
+          <w:spacing w:val="-4"/>
+        </w:rPr>
+        <w:t xml:space="preserve"/>
       </w:r>
       <w:r>
         <w:rPr>
@@ -1430,7 +1430,7 @@
           <w:spacing w:val="-4"/>
           <w:vertAlign w:val="superscript"/>
         </w:rPr>
-        <w:t>2</w:t>
+        <w:t xml:space="preserve"/>
       </w:r>
       <w:r>
         <w:rPr>
@@ -1438,140 +1438,140 @@
           <w:spacing w:val="-4"/>
           <w:vertAlign w:val="superscript"/>
         </w:rPr>
-        <w:t xml:space="preserve"> </w:t>
-      </w:r>
-      <w:r>
-        <w:rPr>
-          <w:rFonts w:ascii="Times New Roman" w:hAnsi="Times New Roman"/>
-          <w:spacing w:val="-4"/>
-        </w:rPr>
-        <w:t>…</w:t>
-      </w:r>
-      <w:r>
-        <w:rPr>
-          <w:rFonts w:ascii="Times New Roman" w:hAnsi="Times New Roman"/>
-          <w:spacing w:val="-4"/>
-        </w:rPr>
-        <w:t xml:space="preserve"> </w:t>
-      </w:r>
-      <w:r>
-        <w:rPr>
-          <w:rFonts w:ascii="Times New Roman" w:hAnsi="Times New Roman"/>
-          <w:spacing w:val="-4"/>
-        </w:rPr>
-        <w:t>trướ</w:t>
-      </w:r>
-      <w:r>
-        <w:rPr>
-          <w:rFonts w:ascii="Times New Roman" w:hAnsi="Times New Roman"/>
-          <w:spacing w:val="-4"/>
-        </w:rPr>
-        <w:t>c</w:t>
-      </w:r>
-      <w:r>
-        <w:rPr>
-          <w:rFonts w:ascii="Times New Roman" w:hAnsi="Times New Roman"/>
-          <w:spacing w:val="-4"/>
-        </w:rPr>
-        <w:t xml:space="preserve"> </w:t>
-      </w:r>
-      <w:r>
-        <w:rPr>
-          <w:rFonts w:ascii="Times New Roman" w:hAnsi="Times New Roman"/>
-          <w:spacing w:val="-4"/>
-        </w:rPr>
-        <w:t>…</w:t>
-      </w:r>
-      <w:r>
-        <w:rPr>
-          <w:rFonts w:ascii="Times New Roman" w:hAnsi="Times New Roman"/>
-          <w:spacing w:val="-4"/>
-        </w:rPr>
-        <w:t xml:space="preserve"> </w:t>
-      </w:r>
-      <w:r>
-        <w:rPr>
-          <w:rFonts w:ascii="Times New Roman" w:hAnsi="Times New Roman"/>
-          <w:spacing w:val="-4"/>
-        </w:rPr>
-        <w:t>giờ</w:t>
-      </w:r>
-      <w:r>
-        <w:rPr>
-          <w:rFonts w:ascii="Times New Roman" w:hAnsi="Times New Roman"/>
-          <w:spacing w:val="-4"/>
-        </w:rPr>
-        <w:t xml:space="preserve"> …</w:t>
-      </w:r>
-      <w:r>
-        <w:rPr>
-          <w:rFonts w:ascii="Times New Roman" w:hAnsi="Times New Roman"/>
-          <w:spacing w:val="-4"/>
-        </w:rPr>
-        <w:t xml:space="preserve"> </w:t>
-      </w:r>
-      <w:r>
-        <w:rPr>
-          <w:rFonts w:ascii="Times New Roman" w:hAnsi="Times New Roman"/>
-          <w:spacing w:val="-4"/>
-        </w:rPr>
-        <w:t>n</w:t>
-      </w:r>
-      <w:r>
-        <w:rPr>
-          <w:rFonts w:ascii="Times New Roman" w:hAnsi="Times New Roman"/>
-          <w:spacing w:val="-4"/>
-        </w:rPr>
-        <w:t>gày</w:t>
-      </w:r>
-      <w:r>
-        <w:rPr>
-          <w:rFonts w:ascii="Times New Roman" w:hAnsi="Times New Roman"/>
-          <w:spacing w:val="-4"/>
-        </w:rPr>
-        <w:t xml:space="preserve"> </w:t>
-      </w:r>
-      <w:r>
-        <w:rPr>
-          <w:rFonts w:ascii="Times New Roman" w:hAnsi="Times New Roman"/>
-          <w:spacing w:val="-4"/>
-        </w:rPr>
-        <w:t>… tháng</w:t>
-      </w:r>
-      <w:r>
-        <w:rPr>
-          <w:rFonts w:ascii="Times New Roman" w:hAnsi="Times New Roman"/>
-          <w:spacing w:val="-4"/>
-        </w:rPr>
-        <w:t xml:space="preserve"> </w:t>
-      </w:r>
-      <w:r>
-        <w:rPr>
-          <w:rFonts w:ascii="Times New Roman" w:hAnsi="Times New Roman"/>
-          <w:spacing w:val="-4"/>
-        </w:rPr>
-        <w:t>… năm</w:t>
-      </w:r>
-      <w:r>
-        <w:rPr>
-          <w:rFonts w:ascii="Times New Roman" w:hAnsi="Times New Roman"/>
-          <w:spacing w:val="-4"/>
-        </w:rPr>
-        <w:t xml:space="preserve"> </w:t>
-      </w:r>
-      <w:r>
-        <w:rPr>
-          <w:rFonts w:ascii="Times New Roman" w:hAnsi="Times New Roman"/>
-          <w:spacing w:val="-4"/>
-        </w:rPr>
-        <w:t>…</w:t>
-      </w:r>
-      <w:r>
-        <w:rPr>
-          <w:rFonts w:ascii="Times New Roman" w:hAnsi="Times New Roman"/>
-          <w:spacing w:val="-4"/>
-        </w:rPr>
-        <w:t>.</w:t>
+        <w:t xml:space="preserve"/>
+      </w:r>
+      <w:r>
+        <w:rPr>
+          <w:rFonts w:ascii="Times New Roman" w:hAnsi="Times New Roman"/>
+          <w:spacing w:val="-4"/>
+        </w:rPr>
+        <w:t xml:space="preserve"/>
+      </w:r>
+      <w:r>
+        <w:rPr>
+          <w:rFonts w:ascii="Times New Roman" w:hAnsi="Times New Roman"/>
+          <w:spacing w:val="-4"/>
+        </w:rPr>
+        <w:t xml:space="preserve"/>
+      </w:r>
+      <w:r>
+        <w:rPr>
+          <w:rFonts w:ascii="Times New Roman" w:hAnsi="Times New Roman"/>
+          <w:spacing w:val="-4"/>
+        </w:rPr>
+        <w:t xml:space="preserve"/>
+      </w:r>
+      <w:r>
+        <w:rPr>
+          <w:rFonts w:ascii="Times New Roman" w:hAnsi="Times New Roman"/>
+          <w:spacing w:val="-4"/>
+        </w:rPr>
+        <w:t xml:space="preserve"/>
+      </w:r>
+      <w:r>
+        <w:rPr>
+          <w:rFonts w:ascii="Times New Roman" w:hAnsi="Times New Roman"/>
+          <w:spacing w:val="-4"/>
+        </w:rPr>
+        <w:t xml:space="preserve"/>
+      </w:r>
+      <w:r>
+        <w:rPr>
+          <w:rFonts w:ascii="Times New Roman" w:hAnsi="Times New Roman"/>
+          <w:spacing w:val="-4"/>
+        </w:rPr>
+        <w:t xml:space="preserve"/>
+      </w:r>
+      <w:r>
+        <w:rPr>
+          <w:rFonts w:ascii="Times New Roman" w:hAnsi="Times New Roman"/>
+          <w:spacing w:val="-4"/>
+        </w:rPr>
+        <w:t xml:space="preserve"/>
+      </w:r>
+      <w:r>
+        <w:rPr>
+          <w:rFonts w:ascii="Times New Roman" w:hAnsi="Times New Roman"/>
+          <w:spacing w:val="-4"/>
+        </w:rPr>
+        <w:t xml:space="preserve"/>
+      </w:r>
+      <w:r>
+        <w:rPr>
+          <w:rFonts w:ascii="Times New Roman" w:hAnsi="Times New Roman"/>
+          <w:spacing w:val="-4"/>
+        </w:rPr>
+        <w:t xml:space="preserve"/>
+      </w:r>
+      <w:r>
+        <w:rPr>
+          <w:rFonts w:ascii="Times New Roman" w:hAnsi="Times New Roman"/>
+          <w:spacing w:val="-4"/>
+        </w:rPr>
+        <w:t xml:space="preserve"/>
+      </w:r>
+      <w:r>
+        <w:rPr>
+          <w:rFonts w:ascii="Times New Roman" w:hAnsi="Times New Roman"/>
+          <w:spacing w:val="-4"/>
+        </w:rPr>
+        <w:t xml:space="preserve"/>
+      </w:r>
+      <w:r>
+        <w:rPr>
+          <w:rFonts w:ascii="Times New Roman" w:hAnsi="Times New Roman"/>
+          <w:spacing w:val="-4"/>
+        </w:rPr>
+        <w:t xml:space="preserve"/>
+      </w:r>
+      <w:r>
+        <w:rPr>
+          <w:rFonts w:ascii="Times New Roman" w:hAnsi="Times New Roman"/>
+          <w:spacing w:val="-4"/>
+        </w:rPr>
+        <w:t xml:space="preserve"/>
+      </w:r>
+      <w:r>
+        <w:rPr>
+          <w:rFonts w:ascii="Times New Roman" w:hAnsi="Times New Roman"/>
+          <w:spacing w:val="-4"/>
+        </w:rPr>
+        <w:t xml:space="preserve"/>
+      </w:r>
+      <w:r>
+        <w:rPr>
+          <w:rFonts w:ascii="Times New Roman" w:hAnsi="Times New Roman"/>
+          <w:spacing w:val="-4"/>
+        </w:rPr>
+        <w:t xml:space="preserve"/>
+      </w:r>
+      <w:r>
+        <w:rPr>
+          <w:rFonts w:ascii="Times New Roman" w:hAnsi="Times New Roman"/>
+          <w:spacing w:val="-4"/>
+        </w:rPr>
+        <w:t xml:space="preserve"/>
+      </w:r>
+      <w:r>
+        <w:rPr>
+          <w:rFonts w:ascii="Times New Roman" w:hAnsi="Times New Roman"/>
+          <w:spacing w:val="-4"/>
+        </w:rPr>
+        <w:t xml:space="preserve"/>
+      </w:r>
+      <w:r>
+        <w:rPr>
+          <w:rFonts w:ascii="Times New Roman" w:hAnsi="Times New Roman"/>
+          <w:spacing w:val="-4"/>
+        </w:rPr>
+        <w:t xml:space="preserve"/>
+      </w:r>
+      <w:r>
+        <w:rPr>
+          <w:rFonts w:ascii="Times New Roman" w:hAnsi="Times New Roman"/>
+          <w:spacing w:val="-4"/>
+        </w:rPr>
+        <w:t xml:space="preserve"/>
       </w:r>
     </w:p>
     <w:p>
@@ -1588,25 +1588,25 @@
           <w:b/>
           <w:bCs/>
         </w:rPr>
-        <w:t>2.</w:t>
-      </w:r>
-      <w:r>
-        <w:rPr>
-          <w:rFonts w:ascii="Times New Roman" w:hAnsi="Times New Roman"/>
-        </w:rPr>
-        <w:t xml:space="preserve">  </w:t>
-      </w:r>
-      <w:r>
-        <w:rPr>
-          <w:rFonts w:ascii="Times New Roman" w:hAnsi="Times New Roman"/>
-        </w:rPr>
-        <w:t>Cơ quan/tổ chức/cá nhân</w:t>
-      </w:r>
-      <w:r>
-        <w:rPr>
-          <w:rFonts w:ascii="Times New Roman" w:hAnsi="Times New Roman"/>
-        </w:rPr>
-        <w:t xml:space="preserve"> liên quan</w:t>
+        <w:t xml:space="preserve">2. {{juvenileProtection.article2Line}}</w:t>
+      </w:r>
+      <w:r>
+        <w:rPr>
+          <w:rFonts w:ascii="Times New Roman" w:hAnsi="Times New Roman"/>
+        </w:rPr>
+        <w:t xml:space="preserve"/>
+      </w:r>
+      <w:r>
+        <w:rPr>
+          <w:rFonts w:ascii="Times New Roman" w:hAnsi="Times New Roman"/>
+        </w:rPr>
+        <w:t xml:space="preserve"/>
+      </w:r>
+      <w:r>
+        <w:rPr>
+          <w:rFonts w:ascii="Times New Roman" w:hAnsi="Times New Roman"/>
+        </w:rPr>
+        <w:t xml:space="preserve"/>
       </w:r>
       <w:r>
         <w:rPr>
@@ -1619,122 +1619,122 @@
         <w:rPr>
           <w:rFonts w:ascii="Times New Roman" w:hAnsi="Times New Roman"/>
         </w:rPr>
-        <w:t>…</w:t>
-      </w:r>
-      <w:r>
-        <w:rPr>
-          <w:rFonts w:ascii="Times New Roman" w:hAnsi="Times New Roman"/>
-        </w:rPr>
-        <w:t xml:space="preserve"> phối hợp chặt chẽ vớ</w:t>
-      </w:r>
-      <w:r>
-        <w:rPr>
-          <w:rFonts w:ascii="Times New Roman" w:hAnsi="Times New Roman"/>
-        </w:rPr>
-        <w:t>i</w:t>
+        <w:t xml:space="preserve"/>
+      </w:r>
+      <w:r>
+        <w:rPr>
+          <w:rFonts w:ascii="Times New Roman" w:hAnsi="Times New Roman"/>
+        </w:rPr>
+        <w:t xml:space="preserve"/>
+      </w:r>
+      <w:r>
+        <w:rPr>
+          <w:rFonts w:ascii="Times New Roman" w:hAnsi="Times New Roman"/>
+        </w:rPr>
+        <w:t xml:space="preserve"/>
       </w:r>
       <w:r>
         <w:rPr>
           <w:rFonts w:ascii="Times New Roman" w:hAnsi="Times New Roman"/>
           <w:vertAlign w:val="superscript"/>
         </w:rPr>
-        <w:t>7</w:t>
-      </w:r>
-      <w:r>
-        <w:rPr>
-          <w:rFonts w:ascii="Times New Roman" w:hAnsi="Times New Roman"/>
-        </w:rPr>
-        <w:t>… trong việc</w:t>
-      </w:r>
-      <w:r>
-        <w:rPr>
-          <w:rFonts w:ascii="Times New Roman" w:hAnsi="Times New Roman"/>
-        </w:rPr>
-        <w:t xml:space="preserve"> </w:t>
-      </w:r>
-      <w:r>
-        <w:rPr>
-          <w:rFonts w:ascii="Times New Roman" w:hAnsi="Times New Roman"/>
-        </w:rPr>
-        <w:t>rà soát,</w:t>
-      </w:r>
-      <w:r>
-        <w:rPr>
-          <w:rFonts w:ascii="Times New Roman" w:hAnsi="Times New Roman"/>
-        </w:rPr>
-        <w:t xml:space="preserve"> cung cấp thông tin,</w:t>
-      </w:r>
-      <w:r>
-        <w:rPr>
-          <w:rFonts w:ascii="Times New Roman" w:hAnsi="Times New Roman"/>
-        </w:rPr>
-        <w:t xml:space="preserve"> phát hiện và xử lý hành vi phát tán trái pháp luật</w:t>
-      </w:r>
-      <w:r>
-        <w:rPr>
-          <w:rFonts w:ascii="Times New Roman" w:hAnsi="Times New Roman"/>
-        </w:rPr>
-        <w:t xml:space="preserve"> </w:t>
-      </w:r>
-      <w:r>
-        <w:rPr>
-          <w:rFonts w:ascii="Times New Roman" w:hAnsi="Times New Roman"/>
-        </w:rPr>
-        <w:t>thông tin</w:t>
-      </w:r>
-      <w:r>
-        <w:rPr>
-          <w:rFonts w:ascii="Times New Roman" w:hAnsi="Times New Roman"/>
-        </w:rPr>
-        <w:t>/</w:t>
-      </w:r>
-      <w:r>
-        <w:rPr>
-          <w:rFonts w:ascii="Times New Roman" w:hAnsi="Times New Roman"/>
-        </w:rPr>
-        <w:t>hình ảnh</w:t>
-      </w:r>
-      <w:r>
-        <w:rPr>
-          <w:rFonts w:ascii="Times New Roman" w:hAnsi="Times New Roman"/>
-        </w:rPr>
-        <w:t>/</w:t>
-      </w:r>
-      <w:r>
-        <w:rPr>
-          <w:rFonts w:ascii="Times New Roman" w:hAnsi="Times New Roman"/>
-        </w:rPr>
-        <w:t>… cá nhân của người chưa thành niên</w:t>
-      </w:r>
-      <w:r>
-        <w:rPr>
-          <w:rFonts w:ascii="Times New Roman" w:hAnsi="Times New Roman"/>
-        </w:rPr>
-        <w:t xml:space="preserve"> để </w:t>
-      </w:r>
-      <w:r>
-        <w:rPr>
-          <w:rFonts w:ascii="Times New Roman" w:hAnsi="Times New Roman"/>
-        </w:rPr>
-        <w:t>bảo đảm quyền</w:t>
-      </w:r>
-      <w:r>
-        <w:rPr>
-          <w:rFonts w:ascii="Times New Roman" w:hAnsi="Times New Roman"/>
-        </w:rPr>
-        <w:t xml:space="preserve"> và</w:t>
-      </w:r>
-      <w:r>
-        <w:rPr>
-          <w:rFonts w:ascii="Times New Roman" w:hAnsi="Times New Roman"/>
-        </w:rPr>
-        <w:t xml:space="preserve"> lợi hợp pháp của người chưa thành niên.</w:t>
-      </w:r>
-      <w:r>
-        <w:rPr>
-          <w:rFonts w:ascii="Times New Roman" w:hAnsi="Times New Roman"/>
-        </w:rPr>
-        <w:t>/.</w:t>
+        <w:t xml:space="preserve"/>
+      </w:r>
+      <w:r>
+        <w:rPr>
+          <w:rFonts w:ascii="Times New Roman" w:hAnsi="Times New Roman"/>
+        </w:rPr>
+        <w:t xml:space="preserve"/>
+      </w:r>
+      <w:r>
+        <w:rPr>
+          <w:rFonts w:ascii="Times New Roman" w:hAnsi="Times New Roman"/>
+        </w:rPr>
+        <w:t xml:space="preserve"/>
+      </w:r>
+      <w:r>
+        <w:rPr>
+          <w:rFonts w:ascii="Times New Roman" w:hAnsi="Times New Roman"/>
+        </w:rPr>
+        <w:t xml:space="preserve"/>
+      </w:r>
+      <w:r>
+        <w:rPr>
+          <w:rFonts w:ascii="Times New Roman" w:hAnsi="Times New Roman"/>
+        </w:rPr>
+        <w:t xml:space="preserve"/>
+      </w:r>
+      <w:r>
+        <w:rPr>
+          <w:rFonts w:ascii="Times New Roman" w:hAnsi="Times New Roman"/>
+        </w:rPr>
+        <w:t xml:space="preserve"/>
+      </w:r>
+      <w:r>
+        <w:rPr>
+          <w:rFonts w:ascii="Times New Roman" w:hAnsi="Times New Roman"/>
+        </w:rPr>
+        <w:t xml:space="preserve"/>
+      </w:r>
+      <w:r>
+        <w:rPr>
+          <w:rFonts w:ascii="Times New Roman" w:hAnsi="Times New Roman"/>
+        </w:rPr>
+        <w:t xml:space="preserve"/>
+      </w:r>
+      <w:r>
+        <w:rPr>
+          <w:rFonts w:ascii="Times New Roman" w:hAnsi="Times New Roman"/>
+        </w:rPr>
+        <w:t xml:space="preserve"/>
+      </w:r>
+      <w:r>
+        <w:rPr>
+          <w:rFonts w:ascii="Times New Roman" w:hAnsi="Times New Roman"/>
+        </w:rPr>
+        <w:t xml:space="preserve"/>
+      </w:r>
+      <w:r>
+        <w:rPr>
+          <w:rFonts w:ascii="Times New Roman" w:hAnsi="Times New Roman"/>
+        </w:rPr>
+        <w:t xml:space="preserve"/>
+      </w:r>
+      <w:r>
+        <w:rPr>
+          <w:rFonts w:ascii="Times New Roman" w:hAnsi="Times New Roman"/>
+        </w:rPr>
+        <w:t xml:space="preserve"/>
+      </w:r>
+      <w:r>
+        <w:rPr>
+          <w:rFonts w:ascii="Times New Roman" w:hAnsi="Times New Roman"/>
+        </w:rPr>
+        <w:t xml:space="preserve"/>
+      </w:r>
+      <w:r>
+        <w:rPr>
+          <w:rFonts w:ascii="Times New Roman" w:hAnsi="Times New Roman"/>
+        </w:rPr>
+        <w:t xml:space="preserve"/>
+      </w:r>
+      <w:r>
+        <w:rPr>
+          <w:rFonts w:ascii="Times New Roman" w:hAnsi="Times New Roman"/>
+        </w:rPr>
+        <w:t xml:space="preserve"/>
+      </w:r>
+      <w:r>
+        <w:rPr>
+          <w:rFonts w:ascii="Times New Roman" w:hAnsi="Times New Roman"/>
+        </w:rPr>
+        <w:t xml:space="preserve"/>
+      </w:r>
+      <w:r>
+        <w:rPr>
+          <w:rFonts w:ascii="Times New Roman" w:hAnsi="Times New Roman"/>
+        </w:rPr>
+        <w:t xml:space="preserve"/>
       </w:r>
     </w:p>
     <w:p>
@@ -1821,7 +1821,7 @@
                 <w:sz w:val="22"/>
                 <w:szCs w:val="22"/>
               </w:rPr>
-              <w:t xml:space="preserve">  - </w:t>
+              <w:t xml:space="preserve">- {{recipients.primaryLine}};</w:t>
             </w:r>
             <w:r>
               <w:rPr>
@@ -1830,7 +1830,7 @@
                 <w:szCs w:val="22"/>
                 <w:vertAlign w:val="superscript"/>
               </w:rPr>
-              <w:t>5</w:t>
+              <w:t xml:space="preserve"/>
             </w:r>
             <w:r>
               <w:rPr>
@@ -1838,7 +1838,7 @@
                 <w:sz w:val="22"/>
                 <w:szCs w:val="22"/>
               </w:rPr>
-              <w:t>…</w:t>
+              <w:t xml:space="preserve"/>
             </w:r>
             <w:r>
               <w:rPr>
@@ -1846,7 +1846,7 @@
                 <w:sz w:val="22"/>
                 <w:szCs w:val="22"/>
               </w:rPr>
-              <w:t>;</w:t>
+              <w:t xml:space="preserve"/>
             </w:r>
           </w:p>
           <w:p>
@@ -1864,7 +1864,7 @@
                 <w:sz w:val="22"/>
                 <w:szCs w:val="22"/>
               </w:rPr>
-              <w:t xml:space="preserve">  - </w:t>
+              <w:t xml:space="preserve">- {{recipients.investigationAuthorityLine}};</w:t>
             </w:r>
             <w:r>
               <w:rPr>
@@ -1873,7 +1873,7 @@
                 <w:szCs w:val="22"/>
                 <w:vertAlign w:val="superscript"/>
               </w:rPr>
-              <w:t>7</w:t>
+              <w:t xml:space="preserve"/>
             </w:r>
             <w:r>
               <w:rPr>
@@ -1881,7 +1881,7 @@
                 <w:sz w:val="22"/>
                 <w:szCs w:val="22"/>
               </w:rPr>
-              <w:t>…;</w:t>
+              <w:t xml:space="preserve"/>
             </w:r>
           </w:p>
           <w:p>
@@ -1899,7 +1899,7 @@
                 <w:sz w:val="22"/>
                 <w:szCs w:val="22"/>
               </w:rPr>
-              <w:t xml:space="preserve">  - </w:t>
+              <w:t xml:space="preserve">- {{recipients.otherRecipientsLine}};</w:t>
             </w:r>
             <w:r>
               <w:rPr>
@@ -1908,7 +1908,7 @@
                 <w:szCs w:val="22"/>
                 <w:vertAlign w:val="superscript"/>
               </w:rPr>
-              <w:t>8</w:t>
+              <w:t xml:space="preserve"/>
             </w:r>
             <w:r>
               <w:rPr>
@@ -1916,7 +1916,7 @@
                 <w:sz w:val="22"/>
                 <w:szCs w:val="22"/>
               </w:rPr>
-              <w:t>…;</w:t>
+              <w:t xml:space="preserve"/>
             </w:r>
           </w:p>
           <w:p>
@@ -1934,7 +1934,7 @@
                 <w:sz w:val="22"/>
                 <w:szCs w:val="22"/>
               </w:rPr>
-              <w:t>- Lưu</w:t>
+              <w:t xml:space="preserve">- {{recipients.archiveLine}}.</w:t>
             </w:r>
             <w:r>
               <w:rPr>
@@ -1942,7 +1942,7 @@
                 <w:sz w:val="22"/>
                 <w:szCs w:val="22"/>
               </w:rPr>
-              <w:t xml:space="preserve">: </w:t>
+              <w:t xml:space="preserve"/>
             </w:r>
             <w:r>
               <w:rPr>
@@ -1950,7 +1950,7 @@
                 <w:sz w:val="22"/>
                 <w:szCs w:val="22"/>
               </w:rPr>
-              <w:t>HS</w:t>
+              <w:t xml:space="preserve"/>
             </w:r>
             <w:r>
               <w:rPr>
@@ -1958,7 +1958,7 @@
                 <w:sz w:val="22"/>
                 <w:szCs w:val="22"/>
               </w:rPr>
-              <w:t>VV/</w:t>
+              <w:t xml:space="preserve"/>
             </w:r>
             <w:r>
               <w:rPr>
@@ -1966,7 +1966,7 @@
                 <w:sz w:val="22"/>
                 <w:szCs w:val="22"/>
               </w:rPr>
-              <w:t>V</w:t>
+              <w:t xml:space="preserve"/>
             </w:r>
             <w:r>
               <w:rPr>
@@ -1974,7 +1974,7 @@
                 <w:sz w:val="22"/>
                 <w:szCs w:val="22"/>
               </w:rPr>
-              <w:t>A</w:t>
+              <w:t xml:space="preserve"/>
             </w:r>
             <w:r>
               <w:rPr>
@@ -1982,7 +1982,7 @@
                 <w:sz w:val="22"/>
                 <w:szCs w:val="22"/>
               </w:rPr>
-              <w:t xml:space="preserve">, </w:t>
+              <w:t xml:space="preserve"/>
             </w:r>
             <w:r>
               <w:rPr>
@@ -1990,7 +1990,7 @@
                 <w:sz w:val="22"/>
                 <w:szCs w:val="22"/>
               </w:rPr>
-              <w:t>HSKS, VP.</w:t>
+              <w:t xml:space="preserve"/>
             </w:r>
           </w:p>
           <w:p>
@@ -2059,7 +2059,7 @@
                 <w:bCs/>
                 <w:sz w:val="24"/>
               </w:rPr>
-              <w:t>……………………………..</w:t>
+              <w:t xml:space="preserve">{{signature.signerName}}</w:t>
             </w:r>
           </w:p>
           <w:p>

</xml_diff>